<commit_message>
vault backup: 2026-04-06 21:12:47
</commit_message>
<xml_diff>
--- a/大二下/ECECS/文件/WA WK6 Tutorial Proforma_CHECK IN 1.docx
+++ b/大二下/ECECS/文件/WA WK6 Tutorial Proforma_CHECK IN 1.docx
@@ -130,12 +130,7 @@
         <w:t>two</w:t>
       </w:r>
       <w:r>
-        <w:t xml:space="preserve"> hard copies of your completed checklist (one for you and </w:t>
-      </w:r>
-      <w:bookmarkStart w:id="0" w:name="_GoBack"/>
-      <w:bookmarkEnd w:id="0"/>
-      <w:r>
-        <w:t>one for your teacher) and bring to the tutorial.</w:t>
+        <w:t xml:space="preserve"> hard copies of your completed checklist (one for you and one for your teacher) and bring to the tutorial.</w:t>
       </w:r>
     </w:p>
     <w:p>
@@ -528,10 +523,12 @@
             <w:pPr>
               <w:spacing w:after="0" w:line="240" w:lineRule="auto"/>
               <w:rPr>
-                <w:rFonts w:hint="eastAsia" w:eastAsia="宋体"/>
-                <w:sz w:val="26"/>
-                <w:szCs w:val="26"/>
-                <w:lang w:val="en-US" w:eastAsia="zh-CN"/>
+                <w:rFonts w:hint="eastAsia" w:asciiTheme="minorHAnsi" w:hAnsiTheme="minorHAnsi" w:eastAsiaTheme="minorHAnsi" w:cstheme="minorBidi"/>
+                <w:kern w:val="2"/>
+                <w:sz w:val="26"/>
+                <w:szCs w:val="26"/>
+                <w:lang w:val="en-US" w:eastAsia="zh-CN" w:bidi="ar-SA"/>
+                <w14:ligatures w14:val="standardContextual"/>
               </w:rPr>
             </w:pPr>
             <w:r>
@@ -559,18 +556,7 @@
                 <w:lang w:val="en-GB" w:eastAsia="en-US" w:bidi="ar-SA"/>
                 <w14:ligatures w14:val="standardContextual"/>
               </w:rPr>
-              <w:t>The lack of macro-level tracking for the informal "Matatu" minibus system, leading to chronic congestion and transit uncertainty.</w:t>
-            </w:r>
-            <w:r>
-              <w:rPr>
-                <w:rFonts w:hint="default" w:asciiTheme="minorHAnsi" w:hAnsiTheme="minorHAnsi" w:eastAsiaTheme="minorHAnsi" w:cstheme="minorBidi"/>
-                <w:kern w:val="2"/>
-                <w:sz w:val="26"/>
-                <w:szCs w:val="26"/>
-                <w:lang w:val="en-GB" w:eastAsia="en-US" w:bidi="ar-SA"/>
-                <w14:ligatures w14:val="standardContextual"/>
-              </w:rPr>
-              <w:t> </w:t>
+              <w:t>Severe urban gridlock and unreliability driven by the highly informal Matatu paratransit system, which operates with irregular routes and fluctuating fares. The "digital blindness" of these fleets excludes low-income commuters from efficient transit planning.</w:t>
             </w:r>
           </w:p>
           <w:p>
@@ -866,7 +852,23 @@
                 <w:sz w:val="26"/>
                 <w:szCs w:val="26"/>
               </w:rPr>
-              <w:t>Would solving the issue improve aspects of EDI for the location? Think about this and make some notes.</w:t>
+              <w:t>Would solving the issue improve aspects of ED</w:t>
+            </w:r>
+            <w:r>
+              <w:rPr>
+                <w:b/>
+                <w:bCs/>
+                <w:sz w:val="26"/>
+                <w:szCs w:val="26"/>
+              </w:rPr>
+              <w:t>I for t</w:t>
+            </w:r>
+            <w:r>
+              <w:rPr>
+                <w:sz w:val="26"/>
+                <w:szCs w:val="26"/>
+              </w:rPr>
+              <w:t>he location? Think about this and make some notes.</w:t>
             </w:r>
           </w:p>
         </w:tc>
@@ -922,8 +924,12 @@
             <w:pPr>
               <w:spacing w:after="0" w:line="240" w:lineRule="auto"/>
               <w:rPr>
-                <w:sz w:val="26"/>
-                <w:szCs w:val="26"/>
+                <w:rFonts w:asciiTheme="minorHAnsi" w:hAnsiTheme="minorHAnsi" w:eastAsiaTheme="minorHAnsi" w:cstheme="minorBidi"/>
+                <w:kern w:val="2"/>
+                <w:sz w:val="26"/>
+                <w:szCs w:val="26"/>
+                <w:lang w:val="en-GB" w:eastAsia="en-US" w:bidi="ar-SA"/>
+                <w14:ligatures w14:val="standardContextual"/>
               </w:rPr>
             </w:pPr>
             <w:r>
@@ -964,6 +970,17 @@
             </w:r>
             <w:r>
               <w:rPr>
+                <w:rFonts w:asciiTheme="minorHAnsi" w:hAnsiTheme="minorHAnsi" w:eastAsiaTheme="minorHAnsi" w:cstheme="minorBidi"/>
+                <w:kern w:val="2"/>
+                <w:sz w:val="26"/>
+                <w:szCs w:val="26"/>
+                <w:lang w:val="en-GB" w:eastAsia="en-US" w:bidi="ar-SA"/>
+                <w14:ligatures w14:val="standardContextual"/>
+              </w:rPr>
+              <w:t>Equality:</w:t>
+            </w:r>
+            <w:r>
+              <w:rPr>
                 <w:rFonts w:hint="default" w:asciiTheme="minorHAnsi" w:hAnsiTheme="minorHAnsi" w:eastAsiaTheme="minorHAnsi" w:cstheme="minorBidi"/>
                 <w:kern w:val="2"/>
                 <w:sz w:val="26"/>
@@ -971,7 +988,7 @@
                 <w:lang w:val="en-GB" w:eastAsia="en-US" w:bidi="ar-SA"/>
                 <w14:ligatures w14:val="standardContextual"/>
               </w:rPr>
-              <w:t>This project promotes Inclusion by providing reliable transit data to low-income commuters who rely on Matatus. It ensures Equal Access to urban mobility, reducing systemic inequality in transport. </w:t>
+              <w:t xml:space="preserve"> Alleviating "time poverty" for low-income workers who cannot afford premium ride-hailing services like Uber. Diversity: Using low-barrier technologies (passive RF sensing or USSD) to ensure compatibility with basic feature phones, bypassing the "digital divide." Inclusion: Integrating marginalized communities (e.g., Kibera) into the city’s macro-level data infrastructure to ensure future urban planning is equitable.</w:t>
             </w:r>
           </w:p>
           <w:p>
@@ -996,6 +1013,8 @@
                 <w:szCs w:val="26"/>
               </w:rPr>
             </w:pPr>
+            <w:bookmarkStart w:id="0" w:name="_GoBack"/>
+            <w:bookmarkEnd w:id="0"/>
           </w:p>
         </w:tc>
       </w:tr>
@@ -1121,25 +1140,18 @@
             </w:r>
             <w:r>
               <w:rPr>
-                <w:rFonts w:asciiTheme="minorHAnsi" w:hAnsiTheme="minorHAnsi" w:eastAsiaTheme="minorHAnsi" w:cstheme="minorBidi"/>
-                <w:kern w:val="2"/>
-                <w:sz w:val="26"/>
-                <w:szCs w:val="26"/>
-                <w:lang w:val="en-GB" w:eastAsia="en-US" w:bidi="ar-SA"/>
-                <w14:ligatures w14:val="standardContextual"/>
-              </w:rPr>
-              <w:t>My research will focus on using edge-sensing nodes and machine learning for traffic mapping, avoiding high-cost traditional GPS infrastructure.</w:t>
-            </w:r>
-            <w:r>
-              <w:rPr>
-                <w:rFonts w:hint="default" w:asciiTheme="minorHAnsi" w:hAnsiTheme="minorHAnsi" w:eastAsiaTheme="minorHAnsi" w:cstheme="minorBidi"/>
-                <w:kern w:val="2"/>
-                <w:sz w:val="26"/>
-                <w:szCs w:val="26"/>
-                <w:lang w:val="en-GB" w:eastAsia="en-US" w:bidi="ar-SA"/>
-                <w14:ligatures w14:val="standardContextual"/>
-              </w:rPr>
-              <w:t> </w:t>
+                <w:sz w:val="26"/>
+                <w:szCs w:val="26"/>
+              </w:rPr>
+              <w:t xml:space="preserve">My research will compare two low-cost solutions: 1) A hardware-based passive RF edge-sensing network (using STM32) and 2) A software-based locally incentivized crowdsourcing app. The ultimate goal is to provide a data-driven foundation for municipal planners to design </w:t>
+            </w:r>
+            <w:r>
+              <w:rPr>
+                <w:rFonts w:hint="default"/>
+                <w:sz w:val="26"/>
+                <w:szCs w:val="26"/>
+              </w:rPr>
+              <w:t>Bus Rapid Transit (BRT) corridors.</w:t>
             </w:r>
           </w:p>
           <w:p>

</xml_diff>